<commit_message>
Versión estable: Envío de correos mediante enlace web
</commit_message>
<xml_diff>
--- a/assets/base.docx
+++ b/assets/base.docx
@@ -5,13 +5,19 @@
     <w:p>
       <w:pPr>
         <w:pStyle w:val="Ttulo1"/>
+        <w:rPr>
+          <w:b w:val="0"/>
+          <w:bCs w:val="0"/>
+        </w:rPr>
       </w:pPr>
       <w:r>
         <w:rPr>
+          <w:b w:val="0"/>
+          <w:bCs w:val="0"/>
           <w:noProof/>
         </w:rPr>
         <w:drawing>
-          <wp:anchor distT="0" distB="0" distL="114300" distR="114300" simplePos="0" relativeHeight="251661312" behindDoc="0" locked="0" layoutInCell="1" allowOverlap="1" wp14:anchorId="5B07A816" wp14:editId="4F626529">
+          <wp:anchor distT="0" distB="0" distL="114300" distR="114300" simplePos="0" relativeHeight="251659264" behindDoc="0" locked="0" layoutInCell="1" allowOverlap="1" wp14:anchorId="5B07A816" wp14:editId="4F626529">
             <wp:simplePos x="0" y="0"/>
             <wp:positionH relativeFrom="column">
               <wp:posOffset>5336540</wp:posOffset>
@@ -74,34 +80,54 @@
         </w:drawing>
       </w:r>
       <w:r>
+        <w:rPr>
+          <w:b w:val="0"/>
+          <w:bCs w:val="0"/>
+        </w:rPr>
         <w:t>REPORTE</w:t>
       </w:r>
       <w:r>
         <w:rPr>
+          <w:b w:val="0"/>
+          <w:bCs w:val="0"/>
           <w:spacing w:val="-3"/>
         </w:rPr>
         <w:t xml:space="preserve"> </w:t>
       </w:r>
       <w:r>
+        <w:rPr>
+          <w:b w:val="0"/>
+          <w:bCs w:val="0"/>
+        </w:rPr>
         <w:t>DE</w:t>
       </w:r>
       <w:r>
         <w:rPr>
+          <w:b w:val="0"/>
+          <w:bCs w:val="0"/>
           <w:spacing w:val="-3"/>
         </w:rPr>
         <w:t xml:space="preserve"> </w:t>
       </w:r>
       <w:r>
+        <w:rPr>
+          <w:b w:val="0"/>
+          <w:bCs w:val="0"/>
+        </w:rPr>
         <w:t>INSPECCIÓN</w:t>
       </w:r>
       <w:r>
         <w:rPr>
+          <w:b w:val="0"/>
+          <w:bCs w:val="0"/>
           <w:spacing w:val="-3"/>
         </w:rPr>
         <w:t xml:space="preserve"> </w:t>
       </w:r>
       <w:r>
         <w:rPr>
+          <w:b w:val="0"/>
+          <w:bCs w:val="0"/>
           <w:spacing w:val="-2"/>
         </w:rPr>
         <w:t>TÉCNICA</w:t>
@@ -112,22 +138,22 @@
         <w:pStyle w:val="Textoindependiente"/>
         <w:spacing w:before="1"/>
         <w:rPr>
-          <w:rFonts w:ascii="Arial"/>
-          <w:b/>
-          <w:sz w:val="7"/>
+          <w:rFonts w:ascii="Arial" w:hAnsi="Arial" w:cs="Arial"/>
+          <w:sz w:val="20"/>
+          <w:szCs w:val="20"/>
         </w:rPr>
       </w:pPr>
       <w:r>
         <w:rPr>
-          <w:rFonts w:ascii="Arial"/>
-          <w:b/>
+          <w:rFonts w:ascii="Arial" w:hAnsi="Arial" w:cs="Arial"/>
           <w:noProof/>
-          <w:sz w:val="7"/>
+          <w:sz w:val="20"/>
+          <w:szCs w:val="20"/>
         </w:rPr>
         <mc:AlternateContent>
           <mc:Choice Requires="wps">
             <w:drawing>
-              <wp:anchor distT="0" distB="0" distL="0" distR="0" simplePos="0" relativeHeight="251656192" behindDoc="1" locked="0" layoutInCell="1" allowOverlap="1" wp14:anchorId="250A060D" wp14:editId="3A666CF2">
+              <wp:anchor distT="0" distB="0" distL="0" distR="0" simplePos="0" relativeHeight="251655168" behindDoc="1" locked="0" layoutInCell="1" allowOverlap="1" wp14:anchorId="250A060D" wp14:editId="3A666CF2">
                 <wp:simplePos x="0" y="0"/>
                 <wp:positionH relativeFrom="page">
                   <wp:posOffset>406400</wp:posOffset>
@@ -198,7 +224,7 @@
           </mc:Choice>
           <mc:Fallback>
             <w:pict>
-              <v:shape w14:anchorId="4CF15FE1" id="Graphic 2" o:spid="_x0000_s1026" style="position:absolute;margin-left:32pt;margin-top:5.3pt;width:391.3pt;height:2pt;z-index:-251660288;visibility:visible;mso-wrap-style:square;mso-wrap-distance-left:0;mso-wrap-distance-top:0;mso-wrap-distance-right:0;mso-wrap-distance-bottom:0;mso-position-horizontal:absolute;mso-position-horizontal-relative:page;mso-position-vertical:absolute;mso-position-vertical-relative:text;v-text-anchor:top" coordsize="4969510,25400" o:gfxdata="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" path="m4969199,l,,,25400r4969199,l4969199,xe" fillcolor="black" stroked="f">
+              <v:shape w14:anchorId="6AF6BBCA" id="Graphic 2" o:spid="_x0000_s1026" style="position:absolute;margin-left:32pt;margin-top:5.3pt;width:391.3pt;height:2pt;z-index:-251661312;visibility:visible;mso-wrap-style:square;mso-wrap-distance-left:0;mso-wrap-distance-top:0;mso-wrap-distance-right:0;mso-wrap-distance-bottom:0;mso-position-horizontal:absolute;mso-position-horizontal-relative:page;mso-position-vertical:absolute;mso-position-vertical-relative:text;v-text-anchor:top" coordsize="4969510,25400" o:gfxdata="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" path="m4969199,l,,,25400r4969199,l4969199,xe" fillcolor="black" stroked="f">
                 <v:path arrowok="t"/>
                 <w10:wrap type="topAndBottom" anchorx="page"/>
               </v:shape>
@@ -211,9 +237,9 @@
       <w:pPr>
         <w:pStyle w:val="Textoindependiente"/>
         <w:rPr>
-          <w:rFonts w:ascii="Arial"/>
-          <w:b/>
-          <w:sz w:val="20"/>
+          <w:rFonts w:ascii="Arial" w:hAnsi="Arial" w:cs="Arial"/>
+          <w:sz w:val="20"/>
+          <w:szCs w:val="20"/>
         </w:rPr>
       </w:pPr>
     </w:p>
@@ -221,9 +247,9 @@
       <w:pPr>
         <w:pStyle w:val="Textoindependiente"/>
         <w:rPr>
-          <w:rFonts w:ascii="Arial"/>
-          <w:b/>
-          <w:sz w:val="20"/>
+          <w:rFonts w:ascii="Arial" w:hAnsi="Arial" w:cs="Arial"/>
+          <w:sz w:val="20"/>
+          <w:szCs w:val="20"/>
         </w:rPr>
       </w:pPr>
     </w:p>
@@ -232,22 +258,22 @@
         <w:pStyle w:val="Textoindependiente"/>
         <w:spacing w:before="123"/>
         <w:rPr>
-          <w:rFonts w:ascii="Arial"/>
-          <w:b/>
-          <w:sz w:val="20"/>
+          <w:rFonts w:ascii="Arial" w:hAnsi="Arial" w:cs="Arial"/>
+          <w:sz w:val="20"/>
+          <w:szCs w:val="20"/>
         </w:rPr>
       </w:pPr>
       <w:r>
         <w:rPr>
-          <w:rFonts w:ascii="Arial"/>
-          <w:b/>
+          <w:rFonts w:ascii="Arial" w:hAnsi="Arial" w:cs="Arial"/>
           <w:noProof/>
           <w:sz w:val="20"/>
+          <w:szCs w:val="20"/>
         </w:rPr>
         <mc:AlternateContent>
           <mc:Choice Requires="wps">
             <w:drawing>
-              <wp:anchor distT="0" distB="0" distL="0" distR="0" simplePos="0" relativeHeight="487588352" behindDoc="1" locked="0" layoutInCell="1" allowOverlap="1" wp14:anchorId="13B5FEEA" wp14:editId="480116D9">
+              <wp:anchor distT="0" distB="0" distL="0" distR="0" simplePos="0" relativeHeight="251662336" behindDoc="1" locked="0" layoutInCell="1" allowOverlap="1" wp14:anchorId="13B5FEEA" wp14:editId="480116D9">
                 <wp:simplePos x="0" y="0"/>
                 <wp:positionH relativeFrom="page">
                   <wp:posOffset>406400</wp:posOffset>
@@ -293,7 +319,7 @@
                               <w:spacing w:before="195"/>
                               <w:ind w:left="190"/>
                               <w:rPr>
-                                <w:rFonts w:ascii="Arial"/>
+                                <w:rFonts w:ascii="Arial" w:hAnsi="Arial" w:cs="Arial"/>
                                 <w:b/>
                                 <w:color w:val="000000"/>
                                 <w:sz w:val="24"/>
@@ -301,7 +327,7 @@
                             </w:pPr>
                             <w:r>
                               <w:rPr>
-                                <w:rFonts w:ascii="Arial"/>
+                                <w:rFonts w:ascii="Arial" w:hAnsi="Arial" w:cs="Arial"/>
                                 <w:b/>
                                 <w:color w:val="000000"/>
                                 <w:spacing w:val="-2"/>
@@ -316,51 +342,75 @@
                               <w:spacing w:before="103"/>
                               <w:ind w:left="190" w:right="6538"/>
                               <w:rPr>
+                                <w:rFonts w:ascii="Arial" w:hAnsi="Arial" w:cs="Arial"/>
                                 <w:color w:val="000000"/>
+                                <w:sz w:val="22"/>
+                                <w:szCs w:val="22"/>
                               </w:rPr>
                             </w:pPr>
                             <w:r>
                               <w:rPr>
+                                <w:rFonts w:ascii="Arial" w:hAnsi="Arial" w:cs="Arial"/>
                                 <w:color w:val="000000"/>
+                                <w:sz w:val="22"/>
+                                <w:szCs w:val="22"/>
                               </w:rPr>
                               <w:t>Nombre:</w:t>
                             </w:r>
                             <w:r>
                               <w:rPr>
+                                <w:rFonts w:ascii="Arial" w:hAnsi="Arial" w:cs="Arial"/>
                                 <w:color w:val="000000"/>
                                 <w:spacing w:val="-13"/>
+                                <w:sz w:val="22"/>
+                                <w:szCs w:val="22"/>
                               </w:rPr>
                               <w:t xml:space="preserve"> </w:t>
                             </w:r>
                             <w:r>
                               <w:rPr>
+                                <w:rFonts w:ascii="Arial" w:hAnsi="Arial" w:cs="Arial"/>
                                 <w:color w:val="000000"/>
+                                <w:sz w:val="22"/>
+                                <w:szCs w:val="22"/>
                               </w:rPr>
                               <w:t>Felipe</w:t>
                             </w:r>
                             <w:r>
                               <w:rPr>
+                                <w:rFonts w:ascii="Arial" w:hAnsi="Arial" w:cs="Arial"/>
                                 <w:color w:val="000000"/>
                                 <w:spacing w:val="-12"/>
+                                <w:sz w:val="22"/>
+                                <w:szCs w:val="22"/>
                               </w:rPr>
                               <w:t xml:space="preserve"> </w:t>
                             </w:r>
                             <w:r>
                               <w:rPr>
+                                <w:rFonts w:ascii="Arial" w:hAnsi="Arial" w:cs="Arial"/>
                                 <w:color w:val="000000"/>
+                                <w:sz w:val="22"/>
+                                <w:szCs w:val="22"/>
                               </w:rPr>
                               <w:t>Lagos</w:t>
                             </w:r>
                             <w:r>
                               <w:rPr>
+                                <w:rFonts w:ascii="Arial" w:hAnsi="Arial" w:cs="Arial"/>
                                 <w:color w:val="000000"/>
                                 <w:spacing w:val="-13"/>
+                                <w:sz w:val="22"/>
+                                <w:szCs w:val="22"/>
                               </w:rPr>
                               <w:t xml:space="preserve"> </w:t>
                             </w:r>
                             <w:r>
                               <w:rPr>
+                                <w:rFonts w:ascii="Arial" w:hAnsi="Arial" w:cs="Arial"/>
                                 <w:color w:val="000000"/>
+                                <w:sz w:val="22"/>
+                                <w:szCs w:val="22"/>
                               </w:rPr>
                               <w:t>Bastias Cargo: Ingeniero Agrónomo</w:t>
                             </w:r>
@@ -382,7 +432,7 @@
                 <v:stroke joinstyle="miter"/>
                 <v:path gradientshapeok="t" o:connecttype="rect"/>
               </v:shapetype>
-              <v:shape id="Textbox 3" o:spid="_x0000_s1026" type="#_x0000_t202" style="position:absolute;margin-left:32pt;margin-top:19.4pt;width:531.3pt;height:67.05pt;z-index:-15728128;visibility:visible;mso-wrap-style:square;mso-wrap-distance-left:0;mso-wrap-distance-top:0;mso-wrap-distance-right:0;mso-wrap-distance-bottom:0;mso-position-horizontal:absolute;mso-position-horizontal-relative:page;mso-position-vertical:absolute;mso-position-vertical-relative:text;v-text-anchor:top" o:gfxdata="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" fillcolor="#e3f2fd" strokecolor="#2096f2" strokeweight="1pt">
+              <v:shape id="Textbox 3" o:spid="_x0000_s1026" type="#_x0000_t202" style="position:absolute;margin-left:32pt;margin-top:19.4pt;width:531.3pt;height:67.05pt;z-index:-251654144;visibility:visible;mso-wrap-style:square;mso-wrap-distance-left:0;mso-wrap-distance-top:0;mso-wrap-distance-right:0;mso-wrap-distance-bottom:0;mso-position-horizontal:absolute;mso-position-horizontal-relative:page;mso-position-vertical:absolute;mso-position-vertical-relative:text;v-text-anchor:top" o:gfxdata="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" fillcolor="#e3f2fd" strokecolor="#2096f2" strokeweight="1pt">
                 <v:path arrowok="t"/>
                 <v:textbox inset="0,0,0,0">
                   <w:txbxContent>
@@ -391,7 +441,7 @@
                         <w:spacing w:before="195"/>
                         <w:ind w:left="190"/>
                         <w:rPr>
-                          <w:rFonts w:ascii="Arial"/>
+                          <w:rFonts w:ascii="Arial" w:hAnsi="Arial" w:cs="Arial"/>
                           <w:b/>
                           <w:color w:val="000000"/>
                           <w:sz w:val="24"/>
@@ -399,7 +449,7 @@
                       </w:pPr>
                       <w:r>
                         <w:rPr>
-                          <w:rFonts w:ascii="Arial"/>
+                          <w:rFonts w:ascii="Arial" w:hAnsi="Arial" w:cs="Arial"/>
                           <w:b/>
                           <w:color w:val="000000"/>
                           <w:spacing w:val="-2"/>
@@ -414,51 +464,75 @@
                         <w:spacing w:before="103"/>
                         <w:ind w:left="190" w:right="6538"/>
                         <w:rPr>
+                          <w:rFonts w:ascii="Arial" w:hAnsi="Arial" w:cs="Arial"/>
                           <w:color w:val="000000"/>
+                          <w:sz w:val="22"/>
+                          <w:szCs w:val="22"/>
                         </w:rPr>
                       </w:pPr>
                       <w:r>
                         <w:rPr>
+                          <w:rFonts w:ascii="Arial" w:hAnsi="Arial" w:cs="Arial"/>
                           <w:color w:val="000000"/>
+                          <w:sz w:val="22"/>
+                          <w:szCs w:val="22"/>
                         </w:rPr>
                         <w:t>Nombre:</w:t>
                       </w:r>
                       <w:r>
                         <w:rPr>
+                          <w:rFonts w:ascii="Arial" w:hAnsi="Arial" w:cs="Arial"/>
                           <w:color w:val="000000"/>
                           <w:spacing w:val="-13"/>
+                          <w:sz w:val="22"/>
+                          <w:szCs w:val="22"/>
                         </w:rPr>
                         <w:t xml:space="preserve"> </w:t>
                       </w:r>
                       <w:r>
                         <w:rPr>
+                          <w:rFonts w:ascii="Arial" w:hAnsi="Arial" w:cs="Arial"/>
                           <w:color w:val="000000"/>
+                          <w:sz w:val="22"/>
+                          <w:szCs w:val="22"/>
                         </w:rPr>
                         <w:t>Felipe</w:t>
                       </w:r>
                       <w:r>
                         <w:rPr>
+                          <w:rFonts w:ascii="Arial" w:hAnsi="Arial" w:cs="Arial"/>
                           <w:color w:val="000000"/>
                           <w:spacing w:val="-12"/>
+                          <w:sz w:val="22"/>
+                          <w:szCs w:val="22"/>
                         </w:rPr>
                         <w:t xml:space="preserve"> </w:t>
                       </w:r>
                       <w:r>
                         <w:rPr>
+                          <w:rFonts w:ascii="Arial" w:hAnsi="Arial" w:cs="Arial"/>
                           <w:color w:val="000000"/>
+                          <w:sz w:val="22"/>
+                          <w:szCs w:val="22"/>
                         </w:rPr>
                         <w:t>Lagos</w:t>
                       </w:r>
                       <w:r>
                         <w:rPr>
+                          <w:rFonts w:ascii="Arial" w:hAnsi="Arial" w:cs="Arial"/>
                           <w:color w:val="000000"/>
                           <w:spacing w:val="-13"/>
+                          <w:sz w:val="22"/>
+                          <w:szCs w:val="22"/>
                         </w:rPr>
                         <w:t xml:space="preserve"> </w:t>
                       </w:r>
                       <w:r>
                         <w:rPr>
+                          <w:rFonts w:ascii="Arial" w:hAnsi="Arial" w:cs="Arial"/>
                           <w:color w:val="000000"/>
+                          <w:sz w:val="22"/>
+                          <w:szCs w:val="22"/>
                         </w:rPr>
                         <w:t>Bastias Cargo: Ingeniero Agrónomo</w:t>
                       </w:r>
@@ -477,9 +551,9 @@
         <w:pStyle w:val="Textoindependiente"/>
         <w:spacing w:before="6"/>
         <w:rPr>
-          <w:rFonts w:ascii="Arial"/>
-          <w:b/>
-          <w:sz w:val="16"/>
+          <w:rFonts w:ascii="Arial" w:hAnsi="Arial" w:cs="Arial"/>
+          <w:sz w:val="20"/>
+          <w:szCs w:val="20"/>
         </w:rPr>
       </w:pPr>
     </w:p>
@@ -517,34 +591,34 @@
               <w:pStyle w:val="TableParagraph"/>
               <w:spacing w:before="155"/>
               <w:rPr>
-                <w:rFonts w:ascii="Arial"/>
-                <w:b/>
-                <w:sz w:val="24"/>
+                <w:rFonts w:ascii="Arial" w:hAnsi="Arial" w:cs="Arial"/>
+                <w:sz w:val="20"/>
+                <w:szCs w:val="20"/>
               </w:rPr>
             </w:pPr>
             <w:r>
               <w:rPr>
-                <w:rFonts w:ascii="Arial"/>
-                <w:b/>
-                <w:sz w:val="24"/>
+                <w:rFonts w:ascii="Arial" w:hAnsi="Arial" w:cs="Arial"/>
+                <w:sz w:val="20"/>
+                <w:szCs w:val="20"/>
               </w:rPr>
               <w:t>ID</w:t>
             </w:r>
             <w:r>
               <w:rPr>
-                <w:rFonts w:ascii="Arial"/>
-                <w:b/>
+                <w:rFonts w:ascii="Arial" w:hAnsi="Arial" w:cs="Arial"/>
                 <w:spacing w:val="-1"/>
-                <w:sz w:val="24"/>
+                <w:sz w:val="20"/>
+                <w:szCs w:val="20"/>
               </w:rPr>
               <w:t xml:space="preserve"> </w:t>
             </w:r>
             <w:r>
               <w:rPr>
-                <w:rFonts w:ascii="Arial"/>
-                <w:b/>
+                <w:rFonts w:ascii="Arial" w:hAnsi="Arial" w:cs="Arial"/>
                 <w:spacing w:val="-2"/>
-                <w:sz w:val="24"/>
+                <w:sz w:val="20"/>
+                <w:szCs w:val="20"/>
               </w:rPr>
               <w:t>Plaza</w:t>
             </w:r>
@@ -559,32 +633,34 @@
               <w:pStyle w:val="TableParagraph"/>
               <w:ind w:left="0"/>
               <w:rPr>
-                <w:sz w:val="24"/>
+                <w:rFonts w:ascii="Arial" w:hAnsi="Arial" w:cs="Arial"/>
+                <w:sz w:val="20"/>
+                <w:szCs w:val="20"/>
               </w:rPr>
             </w:pPr>
             <w:r>
               <w:rPr>
-                <w:sz w:val="24"/>
-              </w:rPr>
-              <w:t xml:space="preserve"> </w:t>
-            </w:r>
-            <w:r>
-              <w:rPr>
-                <w:sz w:val="24"/>
-              </w:rPr>
-              <w:t>{{</w:t>
+                <w:rFonts w:ascii="Arial" w:hAnsi="Arial" w:cs="Arial"/>
+                <w:sz w:val="20"/>
+                <w:szCs w:val="20"/>
+              </w:rPr>
+              <w:t xml:space="preserve"> {{</w:t>
             </w:r>
             <w:proofErr w:type="spellStart"/>
             <w:r>
               <w:rPr>
-                <w:sz w:val="24"/>
+                <w:rFonts w:ascii="Arial" w:hAnsi="Arial" w:cs="Arial"/>
+                <w:sz w:val="20"/>
+                <w:szCs w:val="20"/>
               </w:rPr>
               <w:t>plazaId</w:t>
             </w:r>
             <w:proofErr w:type="spellEnd"/>
             <w:r>
               <w:rPr>
-                <w:sz w:val="24"/>
+                <w:rFonts w:ascii="Arial" w:hAnsi="Arial" w:cs="Arial"/>
+                <w:sz w:val="20"/>
+                <w:szCs w:val="20"/>
               </w:rPr>
               <w:t>}}</w:t>
             </w:r>
@@ -605,17 +681,17 @@
               <w:pStyle w:val="TableParagraph"/>
               <w:spacing w:before="155"/>
               <w:rPr>
-                <w:rFonts w:ascii="Arial" w:hAnsi="Arial"/>
-                <w:b/>
-                <w:sz w:val="24"/>
+                <w:rFonts w:ascii="Arial" w:hAnsi="Arial" w:cs="Arial"/>
+                <w:sz w:val="20"/>
+                <w:szCs w:val="20"/>
               </w:rPr>
             </w:pPr>
             <w:r>
               <w:rPr>
-                <w:rFonts w:ascii="Arial" w:hAnsi="Arial"/>
-                <w:b/>
+                <w:rFonts w:ascii="Arial" w:hAnsi="Arial" w:cs="Arial"/>
                 <w:spacing w:val="-2"/>
-                <w:sz w:val="24"/>
+                <w:sz w:val="20"/>
+                <w:szCs w:val="20"/>
               </w:rPr>
               <w:t>DESCRIPCIÓN</w:t>
             </w:r>
@@ -630,32 +706,34 @@
               <w:pStyle w:val="TableParagraph"/>
               <w:ind w:left="0"/>
               <w:rPr>
-                <w:sz w:val="24"/>
+                <w:rFonts w:ascii="Arial" w:hAnsi="Arial" w:cs="Arial"/>
+                <w:sz w:val="20"/>
+                <w:szCs w:val="20"/>
               </w:rPr>
             </w:pPr>
             <w:r>
               <w:rPr>
-                <w:sz w:val="24"/>
-              </w:rPr>
-              <w:t xml:space="preserve"> </w:t>
-            </w:r>
-            <w:r>
-              <w:rPr>
-                <w:sz w:val="24"/>
-              </w:rPr>
-              <w:t>{{</w:t>
+                <w:rFonts w:ascii="Arial" w:hAnsi="Arial" w:cs="Arial"/>
+                <w:sz w:val="20"/>
+                <w:szCs w:val="20"/>
+              </w:rPr>
+              <w:t xml:space="preserve"> {{</w:t>
             </w:r>
             <w:proofErr w:type="spellStart"/>
             <w:r>
               <w:rPr>
-                <w:sz w:val="24"/>
+                <w:rFonts w:ascii="Arial" w:hAnsi="Arial" w:cs="Arial"/>
+                <w:sz w:val="20"/>
+                <w:szCs w:val="20"/>
               </w:rPr>
               <w:t>nombrePlaza</w:t>
             </w:r>
             <w:proofErr w:type="spellEnd"/>
             <w:r>
               <w:rPr>
-                <w:sz w:val="24"/>
+                <w:rFonts w:ascii="Arial" w:hAnsi="Arial" w:cs="Arial"/>
+                <w:sz w:val="20"/>
+                <w:szCs w:val="20"/>
               </w:rPr>
               <w:t>}}</w:t>
             </w:r>
@@ -676,17 +754,17 @@
               <w:pStyle w:val="TableParagraph"/>
               <w:spacing w:before="155"/>
               <w:rPr>
-                <w:rFonts w:ascii="Arial"/>
-                <w:b/>
-                <w:sz w:val="24"/>
+                <w:rFonts w:ascii="Arial" w:hAnsi="Arial" w:cs="Arial"/>
+                <w:sz w:val="20"/>
+                <w:szCs w:val="20"/>
               </w:rPr>
             </w:pPr>
             <w:r>
               <w:rPr>
-                <w:rFonts w:ascii="Arial"/>
-                <w:b/>
+                <w:rFonts w:ascii="Arial" w:hAnsi="Arial" w:cs="Arial"/>
                 <w:spacing w:val="-2"/>
-                <w:sz w:val="24"/>
+                <w:sz w:val="20"/>
+                <w:szCs w:val="20"/>
               </w:rPr>
               <w:t>INSPECTOR</w:t>
             </w:r>
@@ -701,20 +779,18 @@
               <w:pStyle w:val="TableParagraph"/>
               <w:ind w:left="0"/>
               <w:rPr>
-                <w:sz w:val="24"/>
+                <w:rFonts w:ascii="Arial" w:hAnsi="Arial" w:cs="Arial"/>
+                <w:sz w:val="20"/>
+                <w:szCs w:val="20"/>
               </w:rPr>
             </w:pPr>
             <w:r>
               <w:rPr>
-                <w:sz w:val="24"/>
-              </w:rPr>
-              <w:t xml:space="preserve"> </w:t>
-            </w:r>
-            <w:r>
-              <w:rPr>
-                <w:sz w:val="24"/>
-              </w:rPr>
-              <w:t>{{inspector}}</w:t>
+                <w:rFonts w:ascii="Arial" w:hAnsi="Arial" w:cs="Arial"/>
+                <w:sz w:val="20"/>
+                <w:szCs w:val="20"/>
+              </w:rPr>
+              <w:t xml:space="preserve"> {{inspector}}</w:t>
             </w:r>
           </w:p>
         </w:tc>
@@ -733,51 +809,51 @@
               <w:pStyle w:val="TableParagraph"/>
               <w:spacing w:before="155"/>
               <w:rPr>
-                <w:rFonts w:ascii="Arial"/>
-                <w:b/>
-                <w:sz w:val="24"/>
+                <w:rFonts w:ascii="Arial" w:hAnsi="Arial" w:cs="Arial"/>
+                <w:sz w:val="20"/>
+                <w:szCs w:val="20"/>
               </w:rPr>
             </w:pPr>
             <w:r>
               <w:rPr>
-                <w:rFonts w:ascii="Arial"/>
-                <w:b/>
-                <w:sz w:val="24"/>
+                <w:rFonts w:ascii="Arial" w:hAnsi="Arial" w:cs="Arial"/>
+                <w:sz w:val="20"/>
+                <w:szCs w:val="20"/>
               </w:rPr>
               <w:t>FECHA</w:t>
             </w:r>
             <w:r>
               <w:rPr>
-                <w:rFonts w:ascii="Arial"/>
-                <w:b/>
+                <w:rFonts w:ascii="Arial" w:hAnsi="Arial" w:cs="Arial"/>
                 <w:spacing w:val="-2"/>
-                <w:sz w:val="24"/>
+                <w:sz w:val="20"/>
+                <w:szCs w:val="20"/>
               </w:rPr>
               <w:t xml:space="preserve"> </w:t>
             </w:r>
             <w:r>
               <w:rPr>
-                <w:rFonts w:ascii="Arial"/>
-                <w:b/>
-                <w:sz w:val="24"/>
+                <w:rFonts w:ascii="Arial" w:hAnsi="Arial" w:cs="Arial"/>
+                <w:sz w:val="20"/>
+                <w:szCs w:val="20"/>
               </w:rPr>
               <w:t>Y</w:t>
             </w:r>
             <w:r>
               <w:rPr>
-                <w:rFonts w:ascii="Arial"/>
-                <w:b/>
+                <w:rFonts w:ascii="Arial" w:hAnsi="Arial" w:cs="Arial"/>
                 <w:spacing w:val="-2"/>
-                <w:sz w:val="24"/>
+                <w:sz w:val="20"/>
+                <w:szCs w:val="20"/>
               </w:rPr>
               <w:t xml:space="preserve"> </w:t>
             </w:r>
             <w:r>
               <w:rPr>
-                <w:rFonts w:ascii="Arial"/>
-                <w:b/>
+                <w:rFonts w:ascii="Arial" w:hAnsi="Arial" w:cs="Arial"/>
                 <w:spacing w:val="-4"/>
-                <w:sz w:val="24"/>
+                <w:sz w:val="20"/>
+                <w:szCs w:val="20"/>
               </w:rPr>
               <w:t>HORA</w:t>
             </w:r>
@@ -792,12 +868,16 @@
               <w:pStyle w:val="TableParagraph"/>
               <w:ind w:left="159"/>
               <w:rPr>
-                <w:sz w:val="24"/>
+                <w:rFonts w:ascii="Arial" w:hAnsi="Arial" w:cs="Arial"/>
+                <w:sz w:val="20"/>
+                <w:szCs w:val="20"/>
               </w:rPr>
             </w:pPr>
             <w:r>
               <w:rPr>
-                <w:sz w:val="24"/>
+                <w:rFonts w:ascii="Arial" w:hAnsi="Arial" w:cs="Arial"/>
+                <w:sz w:val="20"/>
+                <w:szCs w:val="20"/>
               </w:rPr>
               <w:t>{{fecha}}</w:t>
             </w:r>
@@ -810,9 +890,9 @@
         <w:pStyle w:val="Textoindependiente"/>
         <w:spacing w:before="152"/>
         <w:rPr>
-          <w:rFonts w:ascii="Arial"/>
-          <w:b/>
-          <w:sz w:val="20"/>
+          <w:rFonts w:ascii="Arial" w:hAnsi="Arial" w:cs="Arial"/>
+          <w:sz w:val="20"/>
+          <w:szCs w:val="20"/>
         </w:rPr>
       </w:pPr>
     </w:p>
@@ -830,7 +910,7 @@
         <w:tblLook w:val="04A0" w:firstRow="1" w:lastRow="0" w:firstColumn="1" w:lastColumn="0" w:noHBand="0" w:noVBand="1"/>
       </w:tblPr>
       <w:tblGrid>
-        <w:gridCol w:w="2118"/>
+        <w:gridCol w:w="1718"/>
       </w:tblGrid>
       <w:tr>
         <w:trPr>
@@ -862,18 +942,16 @@
               <w:autoSpaceDN/>
               <w:rPr>
                 <w:rFonts w:ascii="Arial" w:eastAsia="Times New Roman" w:hAnsi="Arial" w:cs="Arial"/>
-                <w:sz w:val="24"/>
-                <w:szCs w:val="24"/>
+                <w:sz w:val="20"/>
+                <w:szCs w:val="20"/>
                 <w:lang w:val="es-CL" w:eastAsia="es-CL"/>
               </w:rPr>
             </w:pPr>
             <w:r>
               <w:rPr>
                 <w:rFonts w:ascii="Arial" w:eastAsia="Times New Roman" w:hAnsi="Arial" w:cs="Arial"/>
-                <w:b/>
-                <w:bCs/>
-                <w:sz w:val="24"/>
-                <w:szCs w:val="24"/>
+                <w:sz w:val="20"/>
+                <w:szCs w:val="20"/>
                 <w:lang w:val="es-CL" w:eastAsia="es-CL"/>
               </w:rPr>
               <w:t>{{#secciones}}</w:t>
@@ -956,16 +1034,14 @@
                     <w:autoSpaceDN/>
                     <w:rPr>
                       <w:rFonts w:ascii="Arial" w:eastAsia="Times New Roman" w:hAnsi="Arial" w:cs="Arial"/>
-                      <w:sz w:val="24"/>
-                      <w:szCs w:val="24"/>
+                      <w:sz w:val="20"/>
+                      <w:szCs w:val="20"/>
                       <w:lang w:val="es-CL" w:eastAsia="es-CL"/>
                     </w:rPr>
                   </w:pPr>
                   <w:r>
                     <w:rPr>
                       <w:rFonts w:ascii="Arial" w:eastAsia="Times New Roman" w:hAnsi="Arial" w:cs="Arial"/>
-                      <w:b/>
-                      <w:bCs/>
                       <w:sz w:val="20"/>
                       <w:szCs w:val="20"/>
                       <w:lang w:val="es-CL" w:eastAsia="es-CL"/>
@@ -976,8 +1052,6 @@
                   <w:r>
                     <w:rPr>
                       <w:rFonts w:ascii="Arial" w:eastAsia="Times New Roman" w:hAnsi="Arial" w:cs="Arial"/>
-                      <w:b/>
-                      <w:bCs/>
                       <w:sz w:val="20"/>
                       <w:szCs w:val="20"/>
                       <w:lang w:val="es-CL" w:eastAsia="es-CL"/>
@@ -988,8 +1062,6 @@
                   <w:r>
                     <w:rPr>
                       <w:rFonts w:ascii="Arial" w:eastAsia="Times New Roman" w:hAnsi="Arial" w:cs="Arial"/>
-                      <w:b/>
-                      <w:bCs/>
                       <w:sz w:val="20"/>
                       <w:szCs w:val="20"/>
                       <w:lang w:val="es-CL" w:eastAsia="es-CL"/>
@@ -1010,7 +1082,7 @@
                     <w:autoSpaceDE/>
                     <w:autoSpaceDN/>
                     <w:rPr>
-                      <w:rFonts w:ascii="Times New Roman" w:eastAsia="Times New Roman" w:hAnsi="Times New Roman" w:cs="Times New Roman"/>
+                      <w:rFonts w:ascii="Arial" w:eastAsia="Times New Roman" w:hAnsi="Arial" w:cs="Arial"/>
                       <w:sz w:val="20"/>
                       <w:szCs w:val="20"/>
                       <w:lang w:val="es-CL" w:eastAsia="es-CL"/>
@@ -1026,9 +1098,9 @@
               <w:spacing w:before="155"/>
               <w:ind w:left="0"/>
               <w:rPr>
-                <w:rFonts w:ascii="Arial"/>
-                <w:b/>
-                <w:sz w:val="24"/>
+                <w:rFonts w:ascii="Arial" w:hAnsi="Arial" w:cs="Arial"/>
+                <w:sz w:val="20"/>
+                <w:szCs w:val="20"/>
               </w:rPr>
             </w:pPr>
           </w:p>
@@ -1043,17 +1115,17 @@
               <w:pStyle w:val="TableParagraph"/>
               <w:spacing w:before="155"/>
               <w:rPr>
-                <w:rFonts w:ascii="Arial" w:hAnsi="Arial"/>
-                <w:b/>
-                <w:sz w:val="24"/>
+                <w:rFonts w:ascii="Arial" w:hAnsi="Arial" w:cs="Arial"/>
+                <w:sz w:val="20"/>
+                <w:szCs w:val="20"/>
               </w:rPr>
             </w:pPr>
             <w:r>
               <w:rPr>
-                <w:rFonts w:ascii="Arial" w:hAnsi="Arial"/>
-                <w:b/>
+                <w:rFonts w:ascii="Arial" w:hAnsi="Arial" w:cs="Arial"/>
                 <w:spacing w:val="-2"/>
-                <w:sz w:val="24"/>
+                <w:sz w:val="20"/>
+                <w:szCs w:val="20"/>
               </w:rPr>
               <w:t>EVALUACIÓN</w:t>
             </w:r>
@@ -1072,24 +1144,24 @@
             <w:pPr>
               <w:pStyle w:val="TableParagraph"/>
               <w:rPr>
-                <w:sz w:val="24"/>
+                <w:rFonts w:ascii="Arial" w:hAnsi="Arial" w:cs="Arial"/>
+                <w:sz w:val="20"/>
+                <w:szCs w:val="20"/>
               </w:rPr>
             </w:pPr>
             <w:r>
               <w:rPr>
-                <w:sz w:val="24"/>
-              </w:rPr>
-              <w:t>{{#items}}</w:t>
-            </w:r>
-            <w:r>
-              <w:rPr>
-                <w:sz w:val="24"/>
-              </w:rPr>
-              <w:t xml:space="preserve"> </w:t>
-            </w:r>
-            <w:r>
-              <w:rPr>
-                <w:sz w:val="24"/>
+                <w:rFonts w:ascii="Arial" w:hAnsi="Arial" w:cs="Arial"/>
+                <w:sz w:val="20"/>
+                <w:szCs w:val="20"/>
+              </w:rPr>
+              <w:t xml:space="preserve">{{#items}} </w:t>
+            </w:r>
+            <w:r>
+              <w:rPr>
+                <w:rFonts w:ascii="Arial" w:hAnsi="Arial" w:cs="Arial"/>
+                <w:sz w:val="20"/>
+                <w:szCs w:val="20"/>
               </w:rPr>
               <w:t>{{criterio}}</w:t>
             </w:r>
@@ -1107,44 +1179,51 @@
               </w:tabs>
               <w:ind w:left="0"/>
               <w:rPr>
-                <w:sz w:val="24"/>
+                <w:rFonts w:ascii="Arial" w:hAnsi="Arial" w:cs="Arial"/>
+                <w:sz w:val="20"/>
+                <w:szCs w:val="20"/>
               </w:rPr>
             </w:pPr>
             <w:r>
               <w:rPr>
-                <w:sz w:val="24"/>
+                <w:rFonts w:ascii="Arial" w:hAnsi="Arial" w:cs="Arial"/>
+                <w:sz w:val="20"/>
+                <w:szCs w:val="20"/>
               </w:rPr>
               <w:t xml:space="preserve">  </w:t>
             </w:r>
             <w:r>
               <w:rPr>
-                <w:sz w:val="24"/>
+                <w:rFonts w:ascii="Arial" w:hAnsi="Arial" w:cs="Arial"/>
+                <w:sz w:val="20"/>
+                <w:szCs w:val="20"/>
               </w:rPr>
               <w:t>{{valor}}</w:t>
             </w:r>
             <w:r>
               <w:rPr>
-                <w:sz w:val="24"/>
+                <w:rFonts w:ascii="Arial" w:hAnsi="Arial" w:cs="Arial"/>
+                <w:sz w:val="20"/>
+                <w:szCs w:val="20"/>
               </w:rPr>
               <w:tab/>
-            </w:r>
-            <w:r>
-              <w:rPr>
-                <w:sz w:val="24"/>
-              </w:rPr>
               <w:t>{{/</w:t>
             </w:r>
             <w:proofErr w:type="spellStart"/>
             <w:r>
               <w:rPr>
-                <w:sz w:val="24"/>
+                <w:rFonts w:ascii="Arial" w:hAnsi="Arial" w:cs="Arial"/>
+                <w:sz w:val="20"/>
+                <w:szCs w:val="20"/>
               </w:rPr>
               <w:t>items</w:t>
             </w:r>
             <w:proofErr w:type="spellEnd"/>
             <w:r>
               <w:rPr>
-                <w:sz w:val="24"/>
+                <w:rFonts w:ascii="Arial" w:hAnsi="Arial" w:cs="Arial"/>
+                <w:sz w:val="20"/>
+                <w:szCs w:val="20"/>
               </w:rPr>
               <w:t>}}</w:t>
             </w:r>
@@ -1163,12 +1242,16 @@
             <w:pPr>
               <w:pStyle w:val="TableParagraph"/>
               <w:rPr>
-                <w:sz w:val="24"/>
+                <w:rFonts w:ascii="Arial" w:hAnsi="Arial" w:cs="Arial"/>
+                <w:sz w:val="20"/>
+                <w:szCs w:val="20"/>
               </w:rPr>
             </w:pPr>
             <w:r>
               <w:rPr>
-                <w:sz w:val="24"/>
+                <w:rFonts w:ascii="Arial" w:hAnsi="Arial" w:cs="Arial"/>
+                <w:sz w:val="20"/>
+                <w:szCs w:val="20"/>
               </w:rPr>
               <w:t>{{/secciones}}</w:t>
             </w:r>
@@ -1183,12 +1266,16 @@
               <w:pStyle w:val="TableParagraph"/>
               <w:ind w:left="0"/>
               <w:rPr>
-                <w:sz w:val="24"/>
+                <w:rFonts w:ascii="Arial" w:hAnsi="Arial" w:cs="Arial"/>
+                <w:sz w:val="20"/>
+                <w:szCs w:val="20"/>
               </w:rPr>
             </w:pPr>
             <w:r>
               <w:rPr>
-                <w:sz w:val="24"/>
+                <w:rFonts w:ascii="Arial" w:hAnsi="Arial" w:cs="Arial"/>
+                <w:sz w:val="20"/>
+                <w:szCs w:val="20"/>
               </w:rPr>
               <w:t xml:space="preserve">   </w:t>
             </w:r>
@@ -1202,250 +1289,273 @@
           <w:tab w:val="left" w:pos="4469"/>
         </w:tabs>
         <w:rPr>
-          <w:sz w:val="16"/>
-          <w:szCs w:val="16"/>
-        </w:rPr>
-      </w:pPr>
-    </w:p>
-    <w:p>
-      <w:pPr>
-        <w:tabs>
-          <w:tab w:val="left" w:pos="4469"/>
-        </w:tabs>
-        <w:rPr>
-          <w:sz w:val="16"/>
-          <w:szCs w:val="16"/>
-        </w:rPr>
-      </w:pPr>
-    </w:p>
-    <w:p>
-      <w:pPr>
-        <w:tabs>
-          <w:tab w:val="left" w:pos="4469"/>
-        </w:tabs>
-        <w:rPr>
-          <w:sz w:val="16"/>
-          <w:szCs w:val="16"/>
-        </w:rPr>
-      </w:pPr>
-    </w:p>
-    <w:p>
-      <w:pPr>
-        <w:tabs>
-          <w:tab w:val="left" w:pos="4469"/>
-        </w:tabs>
-        <w:rPr>
-          <w:sz w:val="16"/>
-          <w:szCs w:val="16"/>
-        </w:rPr>
-      </w:pPr>
-    </w:p>
-    <w:p>
-      <w:pPr>
-        <w:tabs>
-          <w:tab w:val="left" w:pos="4469"/>
-        </w:tabs>
-        <w:rPr>
-          <w:sz w:val="16"/>
-          <w:szCs w:val="16"/>
-        </w:rPr>
-      </w:pPr>
-    </w:p>
-    <w:p>
-      <w:pPr>
-        <w:tabs>
-          <w:tab w:val="left" w:pos="4469"/>
-        </w:tabs>
-        <w:rPr>
-          <w:sz w:val="16"/>
-          <w:szCs w:val="16"/>
-        </w:rPr>
-      </w:pPr>
-    </w:p>
-    <w:p>
-      <w:pPr>
-        <w:tabs>
-          <w:tab w:val="left" w:pos="4469"/>
-        </w:tabs>
-        <w:rPr>
-          <w:sz w:val="16"/>
-          <w:szCs w:val="16"/>
-        </w:rPr>
-      </w:pPr>
-    </w:p>
-    <w:p>
-      <w:pPr>
-        <w:tabs>
-          <w:tab w:val="left" w:pos="4469"/>
-        </w:tabs>
-        <w:rPr>
-          <w:sz w:val="16"/>
-          <w:szCs w:val="16"/>
-        </w:rPr>
-      </w:pPr>
-    </w:p>
-    <w:p>
-      <w:pPr>
-        <w:tabs>
-          <w:tab w:val="left" w:pos="4469"/>
-        </w:tabs>
-        <w:rPr>
-          <w:sz w:val="16"/>
-          <w:szCs w:val="16"/>
-        </w:rPr>
-      </w:pPr>
-    </w:p>
-    <w:p>
-      <w:pPr>
-        <w:tabs>
-          <w:tab w:val="left" w:pos="4469"/>
-        </w:tabs>
-        <w:rPr>
-          <w:sz w:val="16"/>
-          <w:szCs w:val="16"/>
-        </w:rPr>
-      </w:pPr>
-    </w:p>
-    <w:p>
-      <w:pPr>
-        <w:tabs>
-          <w:tab w:val="left" w:pos="4469"/>
-        </w:tabs>
-        <w:rPr>
-          <w:sz w:val="16"/>
-          <w:szCs w:val="16"/>
-        </w:rPr>
-      </w:pPr>
-    </w:p>
-    <w:p>
-      <w:pPr>
-        <w:tabs>
-          <w:tab w:val="left" w:pos="4469"/>
-        </w:tabs>
-        <w:rPr>
-          <w:sz w:val="16"/>
-          <w:szCs w:val="16"/>
-        </w:rPr>
-      </w:pPr>
-    </w:p>
-    <w:p>
-      <w:pPr>
-        <w:tabs>
-          <w:tab w:val="left" w:pos="4469"/>
-        </w:tabs>
-        <w:rPr>
-          <w:sz w:val="16"/>
-          <w:szCs w:val="16"/>
-        </w:rPr>
-      </w:pPr>
-    </w:p>
-    <w:p>
-      <w:pPr>
-        <w:tabs>
-          <w:tab w:val="left" w:pos="4469"/>
-        </w:tabs>
-        <w:rPr>
-          <w:sz w:val="16"/>
-          <w:szCs w:val="16"/>
-        </w:rPr>
-      </w:pPr>
-    </w:p>
-    <w:p>
-      <w:pPr>
-        <w:tabs>
-          <w:tab w:val="left" w:pos="4469"/>
-        </w:tabs>
-        <w:rPr>
-          <w:sz w:val="16"/>
-          <w:szCs w:val="16"/>
-        </w:rPr>
-      </w:pPr>
-    </w:p>
-    <w:p>
-      <w:pPr>
-        <w:tabs>
-          <w:tab w:val="left" w:pos="4469"/>
-        </w:tabs>
-        <w:rPr>
-          <w:sz w:val="16"/>
-          <w:szCs w:val="16"/>
-        </w:rPr>
-      </w:pPr>
-    </w:p>
-    <w:p>
-      <w:pPr>
-        <w:tabs>
-          <w:tab w:val="left" w:pos="4469"/>
-        </w:tabs>
-        <w:rPr>
-          <w:sz w:val="16"/>
-          <w:szCs w:val="16"/>
-        </w:rPr>
-      </w:pPr>
-    </w:p>
-    <w:p>
-      <w:pPr>
-        <w:tabs>
-          <w:tab w:val="left" w:pos="4469"/>
-        </w:tabs>
-        <w:rPr>
-          <w:sz w:val="16"/>
-          <w:szCs w:val="16"/>
-        </w:rPr>
-      </w:pPr>
-    </w:p>
-    <w:p>
-      <w:pPr>
-        <w:tabs>
-          <w:tab w:val="left" w:pos="4469"/>
-        </w:tabs>
-        <w:rPr>
-          <w:sz w:val="16"/>
-          <w:szCs w:val="16"/>
-        </w:rPr>
-      </w:pPr>
-    </w:p>
-    <w:p>
-      <w:pPr>
-        <w:tabs>
-          <w:tab w:val="left" w:pos="4469"/>
-        </w:tabs>
-        <w:rPr>
-          <w:sz w:val="16"/>
-          <w:szCs w:val="16"/>
-        </w:rPr>
-      </w:pPr>
-    </w:p>
-    <w:p>
-      <w:pPr>
-        <w:tabs>
-          <w:tab w:val="left" w:pos="4469"/>
-        </w:tabs>
-        <w:rPr>
-          <w:sz w:val="16"/>
-          <w:szCs w:val="16"/>
-        </w:rPr>
-      </w:pPr>
-    </w:p>
-    <w:p>
-      <w:pPr>
-        <w:tabs>
-          <w:tab w:val="left" w:pos="4469"/>
-        </w:tabs>
-        <w:rPr>
-          <w:sz w:val="16"/>
-          <w:szCs w:val="16"/>
-        </w:rPr>
-      </w:pPr>
-    </w:p>
-    <w:p>
-      <w:pPr>
-        <w:tabs>
-          <w:tab w:val="left" w:pos="4469"/>
-        </w:tabs>
-        <w:rPr>
-          <w:sz w:val="16"/>
-          <w:szCs w:val="16"/>
+          <w:rFonts w:ascii="Arial" w:hAnsi="Arial" w:cs="Arial"/>
+          <w:sz w:val="20"/>
+          <w:szCs w:val="20"/>
+        </w:rPr>
+      </w:pPr>
+    </w:p>
+    <w:p>
+      <w:pPr>
+        <w:tabs>
+          <w:tab w:val="left" w:pos="4469"/>
+        </w:tabs>
+        <w:rPr>
+          <w:rFonts w:ascii="Arial" w:hAnsi="Arial" w:cs="Arial"/>
+          <w:sz w:val="20"/>
+          <w:szCs w:val="20"/>
+        </w:rPr>
+      </w:pPr>
+    </w:p>
+    <w:p>
+      <w:pPr>
+        <w:tabs>
+          <w:tab w:val="left" w:pos="4469"/>
+        </w:tabs>
+        <w:rPr>
+          <w:rFonts w:ascii="Arial" w:hAnsi="Arial" w:cs="Arial"/>
+          <w:sz w:val="20"/>
+          <w:szCs w:val="20"/>
+        </w:rPr>
+      </w:pPr>
+    </w:p>
+    <w:p>
+      <w:pPr>
+        <w:tabs>
+          <w:tab w:val="left" w:pos="4469"/>
+        </w:tabs>
+        <w:rPr>
+          <w:rFonts w:ascii="Arial" w:hAnsi="Arial" w:cs="Arial"/>
+          <w:sz w:val="20"/>
+          <w:szCs w:val="20"/>
+        </w:rPr>
+      </w:pPr>
+    </w:p>
+    <w:p>
+      <w:pPr>
+        <w:tabs>
+          <w:tab w:val="left" w:pos="4469"/>
+        </w:tabs>
+        <w:rPr>
+          <w:rFonts w:ascii="Arial" w:hAnsi="Arial" w:cs="Arial"/>
+          <w:sz w:val="20"/>
+          <w:szCs w:val="20"/>
+        </w:rPr>
+      </w:pPr>
+    </w:p>
+    <w:p>
+      <w:pPr>
+        <w:tabs>
+          <w:tab w:val="left" w:pos="4469"/>
+        </w:tabs>
+        <w:rPr>
+          <w:rFonts w:ascii="Arial" w:hAnsi="Arial" w:cs="Arial"/>
+          <w:sz w:val="20"/>
+          <w:szCs w:val="20"/>
+        </w:rPr>
+      </w:pPr>
+    </w:p>
+    <w:p>
+      <w:pPr>
+        <w:tabs>
+          <w:tab w:val="left" w:pos="4469"/>
+        </w:tabs>
+        <w:rPr>
+          <w:rFonts w:ascii="Arial" w:hAnsi="Arial" w:cs="Arial"/>
+          <w:sz w:val="20"/>
+          <w:szCs w:val="20"/>
+        </w:rPr>
+      </w:pPr>
+    </w:p>
+    <w:p>
+      <w:pPr>
+        <w:tabs>
+          <w:tab w:val="left" w:pos="4469"/>
+        </w:tabs>
+        <w:rPr>
+          <w:rFonts w:ascii="Arial" w:hAnsi="Arial" w:cs="Arial"/>
+          <w:sz w:val="20"/>
+          <w:szCs w:val="20"/>
+        </w:rPr>
+      </w:pPr>
+    </w:p>
+    <w:p>
+      <w:pPr>
+        <w:tabs>
+          <w:tab w:val="left" w:pos="4469"/>
+        </w:tabs>
+        <w:rPr>
+          <w:rFonts w:ascii="Arial" w:hAnsi="Arial" w:cs="Arial"/>
+          <w:sz w:val="20"/>
+          <w:szCs w:val="20"/>
+        </w:rPr>
+      </w:pPr>
+    </w:p>
+    <w:p>
+      <w:pPr>
+        <w:tabs>
+          <w:tab w:val="left" w:pos="4469"/>
+        </w:tabs>
+        <w:rPr>
+          <w:rFonts w:ascii="Arial" w:hAnsi="Arial" w:cs="Arial"/>
+          <w:sz w:val="20"/>
+          <w:szCs w:val="20"/>
+        </w:rPr>
+      </w:pPr>
+    </w:p>
+    <w:p>
+      <w:pPr>
+        <w:tabs>
+          <w:tab w:val="left" w:pos="4469"/>
+        </w:tabs>
+        <w:rPr>
+          <w:rFonts w:ascii="Arial" w:hAnsi="Arial" w:cs="Arial"/>
+          <w:sz w:val="20"/>
+          <w:szCs w:val="20"/>
+        </w:rPr>
+      </w:pPr>
+    </w:p>
+    <w:p>
+      <w:pPr>
+        <w:tabs>
+          <w:tab w:val="left" w:pos="4469"/>
+        </w:tabs>
+        <w:rPr>
+          <w:rFonts w:ascii="Arial" w:hAnsi="Arial" w:cs="Arial"/>
+          <w:sz w:val="20"/>
+          <w:szCs w:val="20"/>
+        </w:rPr>
+      </w:pPr>
+    </w:p>
+    <w:p>
+      <w:pPr>
+        <w:tabs>
+          <w:tab w:val="left" w:pos="4469"/>
+        </w:tabs>
+        <w:rPr>
+          <w:rFonts w:ascii="Arial" w:hAnsi="Arial" w:cs="Arial"/>
+          <w:sz w:val="20"/>
+          <w:szCs w:val="20"/>
+        </w:rPr>
+      </w:pPr>
+    </w:p>
+    <w:p>
+      <w:pPr>
+        <w:tabs>
+          <w:tab w:val="left" w:pos="4469"/>
+        </w:tabs>
+        <w:rPr>
+          <w:rFonts w:ascii="Arial" w:hAnsi="Arial" w:cs="Arial"/>
+          <w:sz w:val="20"/>
+          <w:szCs w:val="20"/>
+        </w:rPr>
+      </w:pPr>
+    </w:p>
+    <w:p>
+      <w:pPr>
+        <w:tabs>
+          <w:tab w:val="left" w:pos="4469"/>
+        </w:tabs>
+        <w:rPr>
+          <w:rFonts w:ascii="Arial" w:hAnsi="Arial" w:cs="Arial"/>
+          <w:sz w:val="20"/>
+          <w:szCs w:val="20"/>
+        </w:rPr>
+      </w:pPr>
+    </w:p>
+    <w:p>
+      <w:pPr>
+        <w:tabs>
+          <w:tab w:val="left" w:pos="4469"/>
+        </w:tabs>
+        <w:rPr>
+          <w:rFonts w:ascii="Arial" w:hAnsi="Arial" w:cs="Arial"/>
+          <w:sz w:val="20"/>
+          <w:szCs w:val="20"/>
+        </w:rPr>
+      </w:pPr>
+    </w:p>
+    <w:p>
+      <w:pPr>
+        <w:tabs>
+          <w:tab w:val="left" w:pos="4469"/>
+        </w:tabs>
+        <w:rPr>
+          <w:rFonts w:ascii="Arial" w:hAnsi="Arial" w:cs="Arial"/>
+          <w:sz w:val="20"/>
+          <w:szCs w:val="20"/>
+        </w:rPr>
+      </w:pPr>
+    </w:p>
+    <w:p>
+      <w:pPr>
+        <w:tabs>
+          <w:tab w:val="left" w:pos="4469"/>
+        </w:tabs>
+        <w:rPr>
+          <w:rFonts w:ascii="Arial" w:hAnsi="Arial" w:cs="Arial"/>
+          <w:sz w:val="20"/>
+          <w:szCs w:val="20"/>
+        </w:rPr>
+      </w:pPr>
+    </w:p>
+    <w:p>
+      <w:pPr>
+        <w:tabs>
+          <w:tab w:val="left" w:pos="4469"/>
+        </w:tabs>
+        <w:rPr>
+          <w:rFonts w:ascii="Arial" w:hAnsi="Arial" w:cs="Arial"/>
+          <w:sz w:val="20"/>
+          <w:szCs w:val="20"/>
+        </w:rPr>
+      </w:pPr>
+    </w:p>
+    <w:p>
+      <w:pPr>
+        <w:tabs>
+          <w:tab w:val="left" w:pos="4469"/>
+        </w:tabs>
+        <w:rPr>
+          <w:rFonts w:ascii="Arial" w:hAnsi="Arial" w:cs="Arial"/>
+          <w:sz w:val="20"/>
+          <w:szCs w:val="20"/>
+        </w:rPr>
+      </w:pPr>
+    </w:p>
+    <w:p>
+      <w:pPr>
+        <w:tabs>
+          <w:tab w:val="left" w:pos="4469"/>
+        </w:tabs>
+        <w:rPr>
+          <w:rFonts w:ascii="Arial" w:hAnsi="Arial" w:cs="Arial"/>
+          <w:sz w:val="20"/>
+          <w:szCs w:val="20"/>
+        </w:rPr>
+      </w:pPr>
+    </w:p>
+    <w:p>
+      <w:pPr>
+        <w:tabs>
+          <w:tab w:val="left" w:pos="4469"/>
+        </w:tabs>
+        <w:rPr>
+          <w:rFonts w:ascii="Arial" w:hAnsi="Arial" w:cs="Arial"/>
+          <w:sz w:val="20"/>
+          <w:szCs w:val="20"/>
+        </w:rPr>
+      </w:pPr>
+    </w:p>
+    <w:p>
+      <w:pPr>
+        <w:tabs>
+          <w:tab w:val="left" w:pos="4469"/>
+        </w:tabs>
+        <w:rPr>
+          <w:rFonts w:ascii="Arial" w:hAnsi="Arial" w:cs="Arial"/>
+          <w:sz w:val="20"/>
+          <w:szCs w:val="20"/>
         </w:rPr>
       </w:pPr>
     </w:p>
@@ -1955,6 +2065,7 @@
   <w:style w:type="character" w:default="1" w:styleId="Fuentedeprrafopredeter">
     <w:name w:val="Default Paragraph Font"/>
     <w:uiPriority w:val="1"/>
+    <w:semiHidden/>
     <w:unhideWhenUsed/>
   </w:style>
   <w:style w:type="table" w:default="1" w:styleId="Tablanormal">

</xml_diff>